<commit_message>
Remove blank screenshot placeholders from manual
</commit_message>
<xml_diff>
--- a/Business_Tax_Permit_Collection_System_User_Manual.docx
+++ b/Business_Tax_Permit_Collection_System_User_Manual.docx
@@ -100,307 +100,6 @@
           <w:sz w:val="21"/>
         </w:rPr>
         <w:t>Important: Before deleting records, restoring backups, importing large files, archiving old years, changing settings, or managing users, ask the Treasurer or system Admin.</w:t>
-      </w:r>
-    </w:p>
-    <w:p>
-      <w:pPr>
-        <w:pStyle w:val="Heading1"/>
-      </w:pPr>
-      <w:r>
-        <w:t>Screenshot Guide</w:t>
-      </w:r>
-    </w:p>
-    <w:p>
-      <w:r>
-        <w:t>When this manual is prepared for printing or PDF, replace these placeholders with screenshots from the actual app.</w:t>
-      </w:r>
-    </w:p>
-    <w:p>
-      <w:pPr>
-        <w:spacing w:before="80" w:after="200"/>
-        <w:jc w:val="center"/>
-        <w:pBdr>
-          <w:bottom w:val="single" w:sz="6" w:space="4" w:color="CBD5E1"/>
-        </w:pBdr>
-      </w:pPr>
-      <w:r>
-        <w:rPr>
-          <w:rFonts w:ascii="Calibri" w:hAnsi="Calibri"/>
-          <w:i/>
-          <w:color w:val="6B7280"/>
-          <w:sz w:val="20"/>
-        </w:rPr>
-        <w:t>[Screenshot: Login screen]</w:t>
-      </w:r>
-    </w:p>
-    <w:p>
-      <w:pPr>
-        <w:spacing w:before="80" w:after="200"/>
-        <w:jc w:val="center"/>
-        <w:pBdr>
-          <w:bottom w:val="single" w:sz="6" w:space="4" w:color="CBD5E1"/>
-        </w:pBdr>
-      </w:pPr>
-      <w:r>
-        <w:rPr>
-          <w:rFonts w:ascii="Calibri" w:hAnsi="Calibri"/>
-          <w:i/>
-          <w:color w:val="6B7280"/>
-          <w:sz w:val="20"/>
-        </w:rPr>
-        <w:t>[Screenshot: Main screen after successful login]</w:t>
-      </w:r>
-    </w:p>
-    <w:p>
-      <w:pPr>
-        <w:spacing w:before="80" w:after="200"/>
-        <w:jc w:val="center"/>
-        <w:pBdr>
-          <w:bottom w:val="single" w:sz="6" w:space="4" w:color="CBD5E1"/>
-        </w:pBdr>
-      </w:pPr>
-      <w:r>
-        <w:rPr>
-          <w:rFonts w:ascii="Calibri" w:hAnsi="Calibri"/>
-          <w:i/>
-          <w:color w:val="6B7280"/>
-          <w:sz w:val="20"/>
-        </w:rPr>
-        <w:t>[Screenshot: Dashboard in light mode]</w:t>
-      </w:r>
-    </w:p>
-    <w:p>
-      <w:pPr>
-        <w:spacing w:before="80" w:after="200"/>
-        <w:jc w:val="center"/>
-        <w:pBdr>
-          <w:bottom w:val="single" w:sz="6" w:space="4" w:color="CBD5E1"/>
-        </w:pBdr>
-      </w:pPr>
-      <w:r>
-        <w:rPr>
-          <w:rFonts w:ascii="Calibri" w:hAnsi="Calibri"/>
-          <w:i/>
-          <w:color w:val="6B7280"/>
-          <w:sz w:val="20"/>
-        </w:rPr>
-        <w:t>[Screenshot: Dashboard in dark mode]</w:t>
-      </w:r>
-    </w:p>
-    <w:p>
-      <w:pPr>
-        <w:spacing w:before="80" w:after="200"/>
-        <w:jc w:val="center"/>
-        <w:pBdr>
-          <w:bottom w:val="single" w:sz="6" w:space="4" w:color="CBD5E1"/>
-        </w:pBdr>
-      </w:pPr>
-      <w:r>
-        <w:rPr>
-          <w:rFonts w:ascii="Calibri" w:hAnsi="Calibri"/>
-          <w:i/>
-          <w:color w:val="6B7280"/>
-          <w:sz w:val="20"/>
-        </w:rPr>
-        <w:t>[Screenshot: Business Records panel]</w:t>
-      </w:r>
-    </w:p>
-    <w:p>
-      <w:pPr>
-        <w:spacing w:before="80" w:after="200"/>
-        <w:jc w:val="center"/>
-        <w:pBdr>
-          <w:bottom w:val="single" w:sz="6" w:space="4" w:color="CBD5E1"/>
-        </w:pBdr>
-      </w:pPr>
-      <w:r>
-        <w:rPr>
-          <w:rFonts w:ascii="Calibri" w:hAnsi="Calibri"/>
-          <w:i/>
-          <w:color w:val="6B7280"/>
-          <w:sz w:val="20"/>
-        </w:rPr>
-        <w:t>[Screenshot: Owner tab]</w:t>
-      </w:r>
-    </w:p>
-    <w:p>
-      <w:pPr>
-        <w:spacing w:before="80" w:after="200"/>
-        <w:jc w:val="center"/>
-        <w:pBdr>
-          <w:bottom w:val="single" w:sz="6" w:space="4" w:color="CBD5E1"/>
-        </w:pBdr>
-      </w:pPr>
-      <w:r>
-        <w:rPr>
-          <w:rFonts w:ascii="Calibri" w:hAnsi="Calibri"/>
-          <w:i/>
-          <w:color w:val="6B7280"/>
-          <w:sz w:val="20"/>
-        </w:rPr>
-        <w:t>[Screenshot: Assessment tab]</w:t>
-      </w:r>
-    </w:p>
-    <w:p>
-      <w:pPr>
-        <w:spacing w:before="80" w:after="200"/>
-        <w:jc w:val="center"/>
-        <w:pBdr>
-          <w:bottom w:val="single" w:sz="6" w:space="4" w:color="CBD5E1"/>
-        </w:pBdr>
-      </w:pPr>
-      <w:r>
-        <w:rPr>
-          <w:rFonts w:ascii="Calibri" w:hAnsi="Calibri"/>
-          <w:i/>
-          <w:color w:val="6B7280"/>
-          <w:sz w:val="20"/>
-        </w:rPr>
-        <w:t>[Screenshot: Fees tab]</w:t>
-      </w:r>
-    </w:p>
-    <w:p>
-      <w:pPr>
-        <w:spacing w:before="80" w:after="200"/>
-        <w:jc w:val="center"/>
-        <w:pBdr>
-          <w:bottom w:val="single" w:sz="6" w:space="4" w:color="CBD5E1"/>
-        </w:pBdr>
-      </w:pPr>
-      <w:r>
-        <w:rPr>
-          <w:rFonts w:ascii="Calibri" w:hAnsi="Calibri"/>
-          <w:i/>
-          <w:color w:val="6B7280"/>
-          <w:sz w:val="20"/>
-        </w:rPr>
-        <w:t>[Screenshot: Payments tab]</w:t>
-      </w:r>
-    </w:p>
-    <w:p>
-      <w:pPr>
-        <w:spacing w:before="80" w:after="200"/>
-        <w:jc w:val="center"/>
-        <w:pBdr>
-          <w:bottom w:val="single" w:sz="6" w:space="4" w:color="CBD5E1"/>
-        </w:pBdr>
-      </w:pPr>
-      <w:r>
-        <w:rPr>
-          <w:rFonts w:ascii="Calibri" w:hAnsi="Calibri"/>
-          <w:i/>
-          <w:color w:val="6B7280"/>
-          <w:sz w:val="20"/>
-        </w:rPr>
-        <w:t>[Screenshot: Receipt preview window]</w:t>
-      </w:r>
-    </w:p>
-    <w:p>
-      <w:pPr>
-        <w:spacing w:before="80" w:after="200"/>
-        <w:jc w:val="center"/>
-        <w:pBdr>
-          <w:bottom w:val="single" w:sz="6" w:space="4" w:color="CBD5E1"/>
-        </w:pBdr>
-      </w:pPr>
-      <w:r>
-        <w:rPr>
-          <w:rFonts w:ascii="Calibri" w:hAnsi="Calibri"/>
-          <w:i/>
-          <w:color w:val="6B7280"/>
-          <w:sz w:val="20"/>
-        </w:rPr>
-        <w:t>[Screenshot: Verify tab]</w:t>
-      </w:r>
-    </w:p>
-    <w:p>
-      <w:pPr>
-        <w:spacing w:before="80" w:after="200"/>
-        <w:jc w:val="center"/>
-        <w:pBdr>
-          <w:bottom w:val="single" w:sz="6" w:space="4" w:color="CBD5E1"/>
-        </w:pBdr>
-      </w:pPr>
-      <w:r>
-        <w:rPr>
-          <w:rFonts w:ascii="Calibri" w:hAnsi="Calibri"/>
-          <w:i/>
-          <w:color w:val="6B7280"/>
-          <w:sz w:val="20"/>
-        </w:rPr>
-        <w:t>[Screenshot: Reports tab]</w:t>
-      </w:r>
-    </w:p>
-    <w:p>
-      <w:pPr>
-        <w:spacing w:before="80" w:after="200"/>
-        <w:jc w:val="center"/>
-        <w:pBdr>
-          <w:bottom w:val="single" w:sz="6" w:space="4" w:color="CBD5E1"/>
-        </w:pBdr>
-      </w:pPr>
-      <w:r>
-        <w:rPr>
-          <w:rFonts w:ascii="Calibri" w:hAnsi="Calibri"/>
-          <w:i/>
-          <w:color w:val="6B7280"/>
-          <w:sz w:val="20"/>
-        </w:rPr>
-        <w:t>[Screenshot: Delinquency notice preview]</w:t>
-      </w:r>
-    </w:p>
-    <w:p>
-      <w:pPr>
-        <w:spacing w:before="80" w:after="200"/>
-        <w:jc w:val="center"/>
-        <w:pBdr>
-          <w:bottom w:val="single" w:sz="6" w:space="4" w:color="CBD5E1"/>
-        </w:pBdr>
-      </w:pPr>
-      <w:r>
-        <w:rPr>
-          <w:rFonts w:ascii="Calibri" w:hAnsi="Calibri"/>
-          <w:i/>
-          <w:color w:val="6B7280"/>
-          <w:sz w:val="20"/>
-        </w:rPr>
-        <w:t>[Screenshot: Settings tab]</w:t>
-      </w:r>
-    </w:p>
-    <w:p>
-      <w:pPr>
-        <w:spacing w:before="80" w:after="200"/>
-        <w:jc w:val="center"/>
-        <w:pBdr>
-          <w:bottom w:val="single" w:sz="6" w:space="4" w:color="CBD5E1"/>
-        </w:pBdr>
-      </w:pPr>
-      <w:r>
-        <w:rPr>
-          <w:rFonts w:ascii="Calibri" w:hAnsi="Calibri"/>
-          <w:i/>
-          <w:color w:val="6B7280"/>
-          <w:sz w:val="20"/>
-        </w:rPr>
-        <w:t>[Screenshot: Audit Log tab]</w:t>
-      </w:r>
-    </w:p>
-    <w:p>
-      <w:pPr>
-        <w:spacing w:before="80" w:after="200"/>
-        <w:jc w:val="center"/>
-        <w:pBdr>
-          <w:bottom w:val="single" w:sz="6" w:space="4" w:color="CBD5E1"/>
-        </w:pBdr>
-      </w:pPr>
-      <w:r>
-        <w:rPr>
-          <w:rFonts w:ascii="Calibri" w:hAnsi="Calibri"/>
-          <w:i/>
-          <w:color w:val="6B7280"/>
-          <w:sz w:val="20"/>
-        </w:rPr>
-        <w:t>[Screenshot: Users tab]</w:t>
       </w:r>
     </w:p>
     <w:p>

</xml_diff>